<commit_message>
docs(QA-5687): evidencias E2E PASS — acuse 89728, rechazo 89729
Co-authored-by: JFCandia-Digital <JFCandia-Digital@users.noreply.github.com>
</commit_message>
<xml_diff>
--- a/docs/api-v3.5/Documento_Evidencias_Pruebas_TestRecepcion.docx
+++ b/docs/api-v3.5/Documento_Evidencias_Pruebas_TestRecepcion.docx
@@ -242,7 +242,7 @@
           </w:tcPr>
           <w:p>
             <w:r>
-              <w:t>9 casos PASS automatizados | Suite Cucumber: 10 scenarios (10 passed)</w:t>
+              <w:t>11 casos PASS automatizados | Cucumber: 12 scenarios (12 passed)</w:t>
             </w:r>
           </w:p>
         </w:tc>
@@ -811,6 +811,38 @@
           </w:p>
         </w:tc>
       </w:tr>
+      <w:tr>
+        <w:tc>
+          <w:tcPr>
+            <w:tcW w:type="dxa" w:w="2880"/>
+          </w:tcPr>
+          <w:p>
+            <w:r>
+              <w:t>24-06-2026</w:t>
+            </w:r>
+          </w:p>
+        </w:tc>
+        <w:tc>
+          <w:tcPr>
+            <w:tcW w:type="dxa" w:w="2880"/>
+          </w:tcPr>
+          <w:p>
+            <w:r>
+              <w:t>E2E OP — ids 89728 (acuse tarea 618820), 89729 (rechazo tarea 618823) — 2/2 passed</w:t>
+            </w:r>
+          </w:p>
+        </w:tc>
+        <w:tc>
+          <w:tcPr>
+            <w:tcW w:type="dxa" w:w="2880"/>
+          </w:tcPr>
+          <w:p>
+            <w:r>
+              <w:t>Flujo integrador completo validado (Patricia)</w:t>
+            </w:r>
+          </w:p>
+        </w:tc>
+      </w:tr>
     </w:tbl>
     <w:p>
       <w:pPr>
@@ -875,7 +907,7 @@
           </w:tcPr>
           <w:p>
             <w:r>
-              <w:t>9 (TC-INT-001 a 009 + 016)</w:t>
+              <w:t>11 (TC-INT-001 a 009, 016, 017, 018)</w:t>
             </w:r>
           </w:p>
         </w:tc>
@@ -900,7 +932,7 @@
           </w:tcPr>
           <w:p>
             <w:r>
-              <w:t>8 (TC-INT-010 a 015, 017, 018)</w:t>
+              <w:t>6 (TC-INT-010 a 015)</w:t>
             </w:r>
           </w:p>
         </w:tc>
@@ -925,7 +957,7 @@
           </w:tcPr>
           <w:p>
             <w:r>
-              <w:t>10</w:t>
+              <w:t>10 (POST) + 2 (E2E OP)</w:t>
             </w:r>
           </w:p>
         </w:tc>
@@ -940,7 +972,7 @@
               <w:rPr>
                 <w:b/>
               </w:rPr>
-              <w:t>Steps ejecutados</w:t>
+              <w:t>Steps ejecutados E2E</w:t>
             </w:r>
           </w:p>
         </w:tc>
@@ -950,7 +982,7 @@
           </w:tcPr>
           <w:p>
             <w:r>
-              <w:t>70</w:t>
+              <w:t>28 (2 scenarios passed)</w:t>
             </w:r>
           </w:p>
         </w:tc>
@@ -965,7 +997,7 @@
               <w:rPr>
                 <w:b/>
               </w:rPr>
-              <w:t>Tiempo ejecución suite</w:t>
+              <w:t>Tiempo ejecución E2E</w:t>
             </w:r>
           </w:p>
         </w:tc>
@@ -975,7 +1007,7 @@
           </w:tcPr>
           <w:p>
             <w:r>
-              <w:t>~14 segundos</w:t>
+              <w:t>~5 segundos</w:t>
             </w:r>
           </w:p>
         </w:tc>
@@ -1000,7 +1032,7 @@
           </w:tcPr>
           <w:p>
             <w:r>
-              <w:t>89721 (probe), 89722, 89723, 89724, 89725, 89726</w:t>
+              <w:t>89721–89726 (POST), 89728 (acuse), 89729 (rechazo)</w:t>
             </w:r>
           </w:p>
         </w:tc>
@@ -1025,7 +1057,32 @@
           </w:tcPr>
           <w:p>
             <w:r>
-              <w:t>6 (89721–89726)</w:t>
+              <w:t>8 (89721–89729)</w:t>
+            </w:r>
+          </w:p>
+        </w:tc>
+      </w:tr>
+      <w:tr>
+        <w:tc>
+          <w:tcPr>
+            <w:tcW w:type="dxa" w:w="4320"/>
+          </w:tcPr>
+          <w:p>
+            <w:r>
+              <w:rPr>
+                <w:b/>
+              </w:rPr>
+              <w:t>Tareas OP procesadas</w:t>
+            </w:r>
+          </w:p>
+        </w:tc>
+        <w:tc>
+          <w:tcPr>
+            <w:tcW w:type="dxa" w:w="4320"/>
+          </w:tcPr>
+          <w:p>
+            <w:r>
+              <w:t>618820 (acuse), 618823 (rechazo)</w:t>
             </w:r>
           </w:p>
         </w:tc>
@@ -1059,7 +1116,7 @@
     <w:p/>
     <w:p>
       <w:r>
-        <w:t>Tras la configuración de credenciales entidad test por infraestructura (Pablo), el endpoint respondió HTTP 200 de forma consistente. Los despachos exitosos generaron correos de recepción DocDigital, confirmando el flujo end-to-end.</w:t>
+        <w:t>Tras la configuración de credenciales entidad test por infraestructura (Pablo), el endpoint respondió HTTP 200 de forma consistente. Los despachos exitosos generaron correos de recepción DocDigital. El flujo E2E en OP receptora (pendientes-recepcion + acuse/rechazo) fue validado con comunicaciones 89728 y 89729, confirmando que la entidad del token OAuth (PDI en QA) recibe y procesa en su OP.</w:t>
       </w:r>
     </w:p>
     <w:p>
@@ -2757,7 +2814,7 @@
               <w:rPr>
                 <w:sz w:val="14"/>
               </w:rPr>
-              <w:t>POST → GET pendientes → PUT acuse</w:t>
+              <w:t>POST → GET pendientes → PUT acuse (isRechazada: false)</w:t>
             </w:r>
           </w:p>
         </w:tc>
@@ -2783,21 +2840,21 @@
               <w:rPr>
                 <w:sz w:val="14"/>
               </w:rPr>
-              <w:t>Pendiente ejecución E2E — npm run test_recepcion_e2e</w:t>
+              <w:t>200 OK — com. 89728, tarea 618820, acuse completada (24-06-2026 13:59:39)</w:t>
             </w:r>
           </w:p>
         </w:tc>
         <w:tc>
           <w:tcPr>
             <w:tcW w:type="dxa" w:w="1234"/>
-            <w:shd w:fill="FFEB9C"/>
+            <w:shd w:fill="C6EFCE"/>
           </w:tcPr>
           <w:p>
             <w:r>
               <w:rPr>
                 <w:sz w:val="14"/>
               </w:rPr>
-              <w:t>Pendiente</w:t>
+              <w:t>PASS</w:t>
             </w:r>
           </w:p>
         </w:tc>
@@ -2851,7 +2908,7 @@
               <w:rPr>
                 <w:sz w:val="14"/>
               </w:rPr>
-              <w:t>POST → GET pendientes → PUT rechazo</w:t>
+              <w:t>POST → GET pendientes → PUT rechazo (isRechazada: true)</w:t>
             </w:r>
           </w:p>
         </w:tc>
@@ -2877,21 +2934,21 @@
               <w:rPr>
                 <w:sz w:val="14"/>
               </w:rPr>
-              <w:t>Pendiente ejecución E2E — npm run test_recepcion_e2e</w:t>
+              <w:t>200 OK — com. 89729, tarea 618823, rechazo completada (24-06-2026 13:59:41)</w:t>
             </w:r>
           </w:p>
         </w:tc>
         <w:tc>
           <w:tcPr>
             <w:tcW w:type="dxa" w:w="1234"/>
-            <w:shd w:fill="FFEB9C"/>
+            <w:shd w:fill="C6EFCE"/>
           </w:tcPr>
           <w:p>
             <w:r>
               <w:rPr>
                 <w:sz w:val="14"/>
               </w:rPr>
-              <w:t>Pendiente</w:t>
+              <w:t>PASS</w:t>
             </w:r>
           </w:p>
         </w:tc>

</xml_diff>